<commit_message>
Letterhead logo variants, email → lyda@, favicon row, tighter thumbs
- New letterhead SVGs (lk-logo-letterhead-{charcoal,champagne,mono,two-tone})
  with a larger tagline (fs 28, letter-spacing 7.2) still aligned with L's
  visible left edge and matched to LK's width via textLength.
- generate_final_stationery.py now rasterizes the letterhead variant for
  DOCX headers (height 2.6cm) and uses the compact horizontal for email
  signatures. Contact email switched from hello@ to lyda@ everywhere in
  repo (24 files).
- Hub: removed the single-option "Logo" concept selector (redundant once
  Option 1 was locked in — Logo Asset section covers it).
- Hub Logo Asset grid: favicons moved to their own row; thumbnail swatch
  bumped to 104×72 and image given width/height 92% so logos read at a
  glance.
- Regenerated textured business card with Courier-slab LK via nano-banana.
</commit_message>
<xml_diff>
--- a/assets/branding/final/stationery/champagne/letterhead.docx
+++ b/assets/branding/final/stationery/champagne/letterhead.docx
@@ -11,7 +11,7 @@
       <w:r>
         <w:drawing>
           <wp:inline xmlns:a="http://schemas.openxmlformats.org/drawingml/2006/main" xmlns:pic="http://schemas.openxmlformats.org/drawingml/2006/picture">
-            <wp:extent cx="2468571" cy="576000"/>
+            <wp:extent cx="1248000" cy="936000"/>
             <wp:docPr id="1" name="Picture 1"/>
             <wp:cNvGraphicFramePr>
               <a:graphicFrameLocks noChangeAspect="1"/>
@@ -20,7 +20,7 @@
               <a:graphicData uri="http://schemas.openxmlformats.org/drawingml/2006/picture">
                 <pic:pic>
                   <pic:nvPicPr>
-                    <pic:cNvPr id="0" name="champagne.png"/>
+                    <pic:cNvPr id="0" name="champagne-letterhead.png"/>
                     <pic:cNvPicPr/>
                   </pic:nvPicPr>
                   <pic:blipFill>
@@ -32,7 +32,7 @@
                   <pic:spPr>
                     <a:xfrm>
                       <a:off x="0" y="0"/>
-                      <a:ext cx="2468571" cy="576000"/>
+                      <a:ext cx="1248000" cy="936000"/>
                     </a:xfrm>
                     <a:prstGeom prst="rect"/>
                   </pic:spPr>
@@ -63,7 +63,7 @@
           <w:color w:val="B0A89A"/>
           <w:sz w:val="16"/>
         </w:rPr>
-        <w:t>0481 742 026  |  hello@lkdesignandbuild.com.au  |  www.lkdesignandbuild.com.au  |  Adelaide, South Australia</w:t>
+        <w:t>0481 742 026  |  lyda@lkdesignandbuild.com.au  |  www.lkdesignandbuild.com.au  |  Adelaide, South Australia</w:t>
       </w:r>
     </w:p>
     <w:p>

</xml_diff>

<commit_message>
Tight viewBox + 3000px export on letterhead logos
The letterhead SVGs had viewBox 800×600 with content only in the
centre ~35% — when rasterized at 1400px and embedded at 2.6cm in
the DOCX header, the LK mark ended up fuzzy and adrift in a big
empty frame. Shrunk viewBox to 280×265 wrapping the actual content
plus ~10px padding, and bumped cairosvg output to 3000px wide so the
embedded PNG stays crisp at print resolution (now ~3000×2840).
</commit_message>
<xml_diff>
--- a/assets/branding/final/stationery/champagne/letterhead.docx
+++ b/assets/branding/final/stationery/champagne/letterhead.docx
@@ -11,7 +11,7 @@
       <w:r>
         <w:drawing>
           <wp:inline xmlns:a="http://schemas.openxmlformats.org/drawingml/2006/main" xmlns:pic="http://schemas.openxmlformats.org/drawingml/2006/picture">
-            <wp:extent cx="1248000" cy="936000"/>
+            <wp:extent cx="989081" cy="936000"/>
             <wp:docPr id="1" name="Picture 1"/>
             <wp:cNvGraphicFramePr>
               <a:graphicFrameLocks noChangeAspect="1"/>
@@ -32,7 +32,7 @@
                   <pic:spPr>
                     <a:xfrm>
                       <a:off x="0" y="0"/>
-                      <a:ext cx="1248000" cy="936000"/>
+                      <a:ext cx="989081" cy="936000"/>
                     </a:xfrm>
                     <a:prstGeom prst="rect"/>
                   </pic:spPr>

</xml_diff>

<commit_message>
Thinner letterhead tagline via PIL + Inter-Thin; tighten logo→rule gap
cairosvg silently ignores SVG font-weight (and fontconfig changes) on
macOS — it was rendering the tagline in a fallback sans at whatever
default weight, so "font-weight=300" never actually got lighter.

Switched letterhead PNG rendering to PIL using Inter-Thin.ttf
directly: each letterhead variant is now drawn glyph-by-glyph with
Courier New for LK and Inter Thin for the tagline, with manual
letter-spacing that matches the SVG output. Horizontal nav PNGs stay
on cairosvg (tiny tagline, weight doesn't matter). Download SVGs
unchanged — browsers with Inter access render them correctly.

Also dropped the DOCX spacing between the logo paragraph and the
horizontal rule: logo paragraph space_after 4pt → 0pt, rule
space_before 2pt → 0pt. Gold rule now sits directly under the
tagline baseline.

Regenerated all 4 letterhead + quote docx and drawing PDFs.
</commit_message>
<xml_diff>
--- a/assets/branding/final/stationery/champagne/letterhead.docx
+++ b/assets/branding/final/stationery/champagne/letterhead.docx
@@ -5,7 +5,7 @@
   <w:body>
     <w:p>
       <w:pPr>
-        <w:spacing w:after="80"/>
+        <w:spacing w:after="0" w:line="240" w:lineRule="auto"/>
         <w:jc w:val="left"/>
       </w:pPr>
       <w:r>
@@ -45,7 +45,7 @@
     </w:p>
     <w:p>
       <w:pPr>
-        <w:spacing w:before="40" w:after="40"/>
+        <w:spacing w:before="0" w:after="40"/>
         <w:pBdr>
           <w:bottom w:val="single" w:sz="4" w:space="1" w:color="C9A96E"/>
         </w:pBdr>

</xml_diff>

<commit_message>
Tighten LK → tagline gap across every logo variant
Reduces the baseline-to-baseline distance between LK and the
DESIGN AND BUILD tagline by 15 vb units (5–7 vb visual gap) so the
two pieces read as one lockup instead of separated elements.

- Primary transparent (champagne/charcoal/two-tone) — tagline y
  390→375, viewBox h 186→171.
- Primary solid (dark/light/mono-dark/mono-light) — same change +
  BG rect h 186→171.
- Horizontal (champagne/charcoal/two-tone/gold) — tagline y 210→195,
  viewBox h 126→111.
- Letterhead (champagne/charcoal/mono/two-tone) — tagline y 400→385,
  viewBox h 194→179.
- Hero in lk-logo-gallery.html — tagline y 345→325.
- OG image — fs=26 tagline y 445→425.

PIL letterhead renderer canvas height now derives from the new
viewBox (3000×1918 instead of 3000×2079) and tg_y updated to 385.
All 4 letterhead/quote DOCX, drawing PDFs, signature HTML and og-image
.jpg/.png regenerated.
</commit_message>
<xml_diff>
--- a/assets/branding/final/stationery/champagne/letterhead.docx
+++ b/assets/branding/final/stationery/champagne/letterhead.docx
@@ -11,7 +11,7 @@
       <w:r>
         <w:drawing>
           <wp:inline xmlns:a="http://schemas.openxmlformats.org/drawingml/2006/main" xmlns:pic="http://schemas.openxmlformats.org/drawingml/2006/picture">
-            <wp:extent cx="1350649" cy="936000"/>
+            <wp:extent cx="1464025" cy="936000"/>
             <wp:docPr id="1" name="Picture 1"/>
             <wp:cNvGraphicFramePr>
               <a:graphicFrameLocks noChangeAspect="1"/>
@@ -32,7 +32,7 @@
                   <pic:spPr>
                     <a:xfrm>
                       <a:off x="0" y="0"/>
-                      <a:ext cx="1350649" cy="936000"/>
+                      <a:ext cx="1464025" cy="936000"/>
                     </a:xfrm>
                     <a:prstGeom prst="rect"/>
                   </pic:spPr>

</xml_diff>

<commit_message>
Logo: reduce tagline right-nudge from +8 to +3 (was overshooting)
The previous +8 vb shift pushed DESIGN AND BUILD well past the L; the
tagline only needed a hair of right movement so the D sits at the L's
left edge rather than slightly inside it. Tagline x now 216 (primary/
letterhead, was 221), 49 (horizontal, was 52), 24 (hero, was 28).
ViewBox width extensions reverted (back to 280 / 160) since the small
nudge keeps the tagline within the original frame. PIL letterhead
renderer + signature logo aspect (160:103) updated to match.
</commit_message>
<xml_diff>
--- a/assets/branding/final/stationery/champagne/letterhead.docx
+++ b/assets/branding/final/stationery/champagne/letterhead.docx
@@ -11,7 +11,7 @@
       <w:r>
         <w:drawing>
           <wp:inline xmlns:a="http://schemas.openxmlformats.org/drawingml/2006/main" xmlns:pic="http://schemas.openxmlformats.org/drawingml/2006/picture">
-            <wp:extent cx="1576642" cy="936000"/>
+            <wp:extent cx="1532751" cy="936000"/>
             <wp:docPr id="1" name="Picture 1"/>
             <wp:cNvGraphicFramePr>
               <a:graphicFrameLocks noChangeAspect="1"/>
@@ -32,7 +32,7 @@
                   <pic:spPr>
                     <a:xfrm>
                       <a:off x="0" y="0"/>
-                      <a:ext cx="1576642" cy="936000"/>
+                      <a:ext cx="1532751" cy="936000"/>
                     </a:xfrm>
                     <a:prstGeom prst="rect"/>
                   </pic:spPr>

</xml_diff>